<commit_message>
Profile: confirm travel OK and proposals/SOWs at every sales role since Accelo. Gravity Global resume updated (score 76); Supermove travel item resolved
Co-Authored-By: Claude Opus 5.5 <noreply@anthropic.com>
Claude-Session: https://claude.ai/code/session_01Quz1wQsVbycgj85WWSYfNT
</commit_message>
<xml_diff>
--- a/applications/gravity-global-account-manager/resume.docx
+++ b/applications/gravity-global-account-manager/resume.docx
@@ -201,7 +201,7 @@
           <w:i w:val="0"/>
           <w:color w:val="1A1A1A"/>
         </w:rPr>
-        <w:t>Expand retainer scope by recommending and scoping complementary services aligned with each client's objectives.</w:t>
+        <w:t>Expand retainer scope by writing proposals and SOWs for complementary services aligned with each client's objectives.</w:t>
       </w:r>
     </w:p>
     <w:p>
@@ -400,6 +400,30 @@
           <w:color w:val="1A1A1A"/>
         </w:rPr>
         <w:t>Advised clients on ad-spend budget planning and allocation across paid campaigns.</w:t>
+      </w:r>
+    </w:p>
+    <w:p>
+      <w:pPr>
+        <w:spacing w:after="30"/>
+        <w:ind w:left="259" w:hanging="259"/>
+      </w:pPr>
+      <w:r>
+        <w:rPr>
+          <w:rFonts w:ascii="Calibri" w:hAnsi="Calibri"/>
+          <w:b w:val="0"/>
+          <w:i w:val="0"/>
+          <w:color w:val="163A5F"/>
+        </w:rPr>
+        <w:t xml:space="preserve">•  </w:t>
+      </w:r>
+      <w:r>
+        <w:rPr>
+          <w:rFonts w:ascii="Calibri" w:hAnsi="Calibri"/>
+          <w:b w:val="0"/>
+          <w:i w:val="0"/>
+          <w:color w:val="1A1A1A"/>
+        </w:rPr>
+        <w:t>Drafted proposals and statements of work that set clear scope, cost, and expectations for client engagements.</w:t>
       </w:r>
     </w:p>
     <w:p>
@@ -903,7 +927,7 @@
           <w:i w:val="0"/>
           <w:color w:val="1A1A1A"/>
         </w:rPr>
-        <w:t>Sold and scoped CRM and project-management software to agencies and professional-services firms, advising C-suite executives on operational system design.</w:t>
+        <w:t>Sold and scoped CRM and project-management software to agencies and professional-services firms, writing proposals and SOWs and advising C-suite executives on operational system design.</w:t>
       </w:r>
     </w:p>
     <w:p>
@@ -969,7 +993,7 @@
           <w:i w:val="0"/>
           <w:color w:val="1A1A1A"/>
         </w:rPr>
-        <w:t>Primary Client Contact, Integrated Campaign Planning, Scope, Budget &amp; Timeline Management, Estimates &amp; Scoping, Account Growth, QBRs &amp; Senior Stakeholder Presentations</w:t>
+        <w:t>Primary Client Contact, Integrated Campaign Planning, Scope, Budget &amp; Timeline Management, Estimates, Proposals &amp; SOWs, Account Growth, QBRs &amp; Senior Stakeholder Presentations</w:t>
       </w:r>
     </w:p>
     <w:p>

</xml_diff>